<commit_message>
Head Bobbing Mechanics completed
Different head bobbing for sprint walk and crouch
</commit_message>
<xml_diff>
--- a/Dokumentasi/Dokumen Fitur First Person.docx
+++ b/Dokumentasi/Dokumen Fitur First Person.docx
@@ -29,9 +29,9 @@
       <w:r>
         <w:drawing>
           <wp:inline distT="0" distB="0" distL="114300" distR="114300">
-            <wp:extent cx="5274310" cy="2228215"/>
-            <wp:effectExtent l="0" t="0" r="8890" b="6985"/>
-            <wp:docPr id="1" name="图片 1"/>
+            <wp:extent cx="5272405" cy="1786255"/>
+            <wp:effectExtent l="0" t="0" r="10795" b="4445"/>
+            <wp:docPr id="3" name="图片 1"/>
             <wp:cNvGraphicFramePr>
               <a:graphicFrameLocks xmlns:a="http://schemas.openxmlformats.org/drawingml/2006/main" noChangeAspect="1"/>
             </wp:cNvGraphicFramePr>
@@ -39,7 +39,7 @@
               <a:graphicData uri="http://schemas.openxmlformats.org/drawingml/2006/picture">
                 <pic:pic xmlns:pic="http://schemas.openxmlformats.org/drawingml/2006/picture">
                   <pic:nvPicPr>
-                    <pic:cNvPr id="1" name="图片 1"/>
+                    <pic:cNvPr id="3" name="图片 1"/>
                     <pic:cNvPicPr>
                       <a:picLocks noChangeAspect="1"/>
                     </pic:cNvPicPr>
@@ -53,7 +53,7 @@
                   <pic:spPr>
                     <a:xfrm>
                       <a:off x="0" y="0"/>
-                      <a:ext cx="5274310" cy="2228215"/>
+                      <a:ext cx="5272405" cy="1786255"/>
                     </a:xfrm>
                     <a:prstGeom prst="rect">
                       <a:avLst/>
@@ -100,17 +100,13 @@
         <w:tabs>
           <w:tab w:val="left" w:pos="1085"/>
         </w:tabs>
-        <w:rPr>
-          <w:rFonts w:hint="default"/>
-          <w:lang w:val="en-US" w:eastAsia="zh-CN"/>
-        </w:rPr>
       </w:pPr>
       <w:r>
         <w:drawing>
           <wp:inline distT="0" distB="0" distL="114300" distR="114300">
-            <wp:extent cx="5259705" cy="2197735"/>
-            <wp:effectExtent l="0" t="0" r="10795" b="12065"/>
-            <wp:docPr id="2" name="图片 2"/>
+            <wp:extent cx="5262245" cy="1868805"/>
+            <wp:effectExtent l="0" t="0" r="8255" b="10795"/>
+            <wp:docPr id="4" name="图片 2"/>
             <wp:cNvGraphicFramePr>
               <a:graphicFrameLocks xmlns:a="http://schemas.openxmlformats.org/drawingml/2006/main" noChangeAspect="1"/>
             </wp:cNvGraphicFramePr>
@@ -118,7 +114,7 @@
               <a:graphicData uri="http://schemas.openxmlformats.org/drawingml/2006/picture">
                 <pic:pic xmlns:pic="http://schemas.openxmlformats.org/drawingml/2006/picture">
                   <pic:nvPicPr>
-                    <pic:cNvPr id="2" name="图片 2"/>
+                    <pic:cNvPr id="4" name="图片 2"/>
                     <pic:cNvPicPr>
                       <a:picLocks noChangeAspect="1"/>
                     </pic:cNvPicPr>
@@ -132,7 +128,7 @@
                   <pic:spPr>
                     <a:xfrm>
                       <a:off x="0" y="0"/>
-                      <a:ext cx="5259705" cy="2197735"/>
+                      <a:ext cx="5262245" cy="1868805"/>
                     </a:xfrm>
                     <a:prstGeom prst="rect">
                       <a:avLst/>
@@ -148,8 +144,166 @@
           </wp:inline>
         </w:drawing>
       </w:r>
+    </w:p>
+    <w:p>
+      <w:pPr>
+        <w:tabs>
+          <w:tab w:val="left" w:pos="1085"/>
+        </w:tabs>
+        <w:rPr>
+          <w:rFonts w:hint="default"/>
+          <w:lang w:val="en-US" w:eastAsia="zh-CN"/>
+        </w:rPr>
+      </w:pPr>
+    </w:p>
+    <w:p>
+      <w:pPr>
+        <w:tabs>
+          <w:tab w:val="left" w:pos="1085"/>
+        </w:tabs>
+        <w:rPr>
+          <w:rFonts w:hint="eastAsia"/>
+          <w:lang w:val="en-US" w:eastAsia="zh-CN"/>
+        </w:rPr>
+      </w:pPr>
+      <w:r>
+        <w:rPr>
+          <w:rFonts w:hint="eastAsia"/>
+          <w:lang w:val="en-US" w:eastAsia="zh-CN"/>
+        </w:rPr>
+        <w:t>Head Bobbing Mechanic</w:t>
+      </w:r>
+    </w:p>
+    <w:p>
+      <w:pPr>
+        <w:tabs>
+          <w:tab w:val="left" w:pos="1085"/>
+        </w:tabs>
+        <w:rPr>
+          <w:rFonts w:hint="default" w:eastAsiaTheme="minorEastAsia"/>
+          <w:lang w:val="en-US" w:eastAsia="zh-CN"/>
+        </w:rPr>
+      </w:pPr>
+      <w:r>
+        <w:drawing>
+          <wp:inline distT="0" distB="0" distL="114300" distR="114300">
+            <wp:extent cx="2974340" cy="956945"/>
+            <wp:effectExtent l="0" t="0" r="10160" b="8255"/>
+            <wp:docPr id="6" name="图片 4"/>
+            <wp:cNvGraphicFramePr>
+              <a:graphicFrameLocks xmlns:a="http://schemas.openxmlformats.org/drawingml/2006/main" noChangeAspect="1"/>
+            </wp:cNvGraphicFramePr>
+            <a:graphic xmlns:a="http://schemas.openxmlformats.org/drawingml/2006/main">
+              <a:graphicData uri="http://schemas.openxmlformats.org/drawingml/2006/picture">
+                <pic:pic xmlns:pic="http://schemas.openxmlformats.org/drawingml/2006/picture">
+                  <pic:nvPicPr>
+                    <pic:cNvPr id="6" name="图片 4"/>
+                    <pic:cNvPicPr>
+                      <a:picLocks noChangeAspect="1"/>
+                    </pic:cNvPicPr>
+                  </pic:nvPicPr>
+                  <pic:blipFill>
+                    <a:blip r:embed="rId6"/>
+                    <a:stretch>
+                      <a:fillRect/>
+                    </a:stretch>
+                  </pic:blipFill>
+                  <pic:spPr>
+                    <a:xfrm>
+                      <a:off x="0" y="0"/>
+                      <a:ext cx="2974340" cy="956945"/>
+                    </a:xfrm>
+                    <a:prstGeom prst="rect">
+                      <a:avLst/>
+                    </a:prstGeom>
+                    <a:noFill/>
+                    <a:ln>
+                      <a:noFill/>
+                    </a:ln>
+                  </pic:spPr>
+                </pic:pic>
+              </a:graphicData>
+            </a:graphic>
+          </wp:inline>
+        </w:drawing>
+      </w:r>
+      <w:r>
+        <w:rPr>
+          <w:rFonts w:hint="eastAsia"/>
+          <w:lang w:val="en-US" w:eastAsia="zh-CN"/>
+        </w:rPr>
+        <w:t xml:space="preserve"> To save the original location of the camera</w:t>
+      </w:r>
+      <w:r>
+        <w:rPr>
+          <w:rFonts w:hint="default"/>
+          <w:lang w:val="en-US" w:eastAsia="zh-CN"/>
+        </w:rPr>
+        <w:t>’</w:t>
+      </w:r>
+      <w:r>
+        <w:rPr>
+          <w:rFonts w:hint="eastAsia"/>
+          <w:lang w:val="en-US" w:eastAsia="zh-CN"/>
+        </w:rPr>
+        <w:t>s root.</w:t>
+      </w:r>
       <w:bookmarkStart w:id="0" w:name="_GoBack"/>
       <w:bookmarkEnd w:id="0"/>
+    </w:p>
+    <w:p>
+      <w:pPr>
+        <w:tabs>
+          <w:tab w:val="left" w:pos="1085"/>
+        </w:tabs>
+        <w:rPr>
+          <w:rFonts w:hint="default"/>
+          <w:lang w:val="en-US" w:eastAsia="zh-CN"/>
+        </w:rPr>
+      </w:pPr>
+      <w:r>
+        <w:drawing>
+          <wp:inline distT="0" distB="0" distL="114300" distR="114300">
+            <wp:extent cx="5260340" cy="2108200"/>
+            <wp:effectExtent l="0" t="0" r="10160" b="0"/>
+            <wp:docPr id="5" name="图片 3"/>
+            <wp:cNvGraphicFramePr>
+              <a:graphicFrameLocks xmlns:a="http://schemas.openxmlformats.org/drawingml/2006/main" noChangeAspect="1"/>
+            </wp:cNvGraphicFramePr>
+            <a:graphic xmlns:a="http://schemas.openxmlformats.org/drawingml/2006/main">
+              <a:graphicData uri="http://schemas.openxmlformats.org/drawingml/2006/picture">
+                <pic:pic xmlns:pic="http://schemas.openxmlformats.org/drawingml/2006/picture">
+                  <pic:nvPicPr>
+                    <pic:cNvPr id="5" name="图片 3"/>
+                    <pic:cNvPicPr>
+                      <a:picLocks noChangeAspect="1"/>
+                    </pic:cNvPicPr>
+                  </pic:nvPicPr>
+                  <pic:blipFill>
+                    <a:blip r:embed="rId7"/>
+                    <a:stretch>
+                      <a:fillRect/>
+                    </a:stretch>
+                  </pic:blipFill>
+                  <pic:spPr>
+                    <a:xfrm>
+                      <a:off x="0" y="0"/>
+                      <a:ext cx="5260340" cy="2108200"/>
+                    </a:xfrm>
+                    <a:prstGeom prst="rect">
+                      <a:avLst/>
+                    </a:prstGeom>
+                    <a:noFill/>
+                    <a:ln>
+                      <a:noFill/>
+                    </a:ln>
+                  </pic:spPr>
+                </pic:pic>
+              </a:graphicData>
+            </a:graphic>
+          </wp:inline>
+        </w:drawing>
+      </w:r>
     </w:p>
     <w:sectPr>
       <w:pgSz w:w="11906" w:h="16838"/>

</xml_diff>